<commit_message>
chore(templates): Kanzlei-Logo aus den AGB entfernt
Das Praetoria-Logo oben rechts auf allen vier AGB-Seiten ist raus, PDF
und DOCX gleichermaßen.

Wichtig für spätere Änderungen an diesem Dokument: Die AGB stammen aus
einer PDF-Konvertierung, bei der JEDER Absatz in einem eigenen
Zeichenrahmen steckt – 196 Stück. Ein pauschales Entfernen aller
Zeichenobjekte löscht deshalb den kompletten Text. Entfernt werden dürfen
nur die vier Rahmen, die tatsächlich ein Bild enthalten (a:blip /
r:embed / pic:pic).

Geprüft: 4 Seiten wie zuvor, kein einziges Wort des Originals fehlt
(Wortabgleich gegen die Ursprungsfassung).

Co-Authored-By: Claude Opus 4.8 <noreply@anthropic.com>
Claude-Session: https://claude.ai/code/session_014YgMb75jZFoQjUWcdwPzAe
</commit_message>
<xml_diff>
--- a/configs/templates/agb-b2b.docx
+++ b/configs/templates/agb-b2b.docx
@@ -11,79 +11,6 @@
       </w:pPr>
       <w:r>
         <w:rPr/>
-        <mc:AlternateContent>
-          <mc:Choice Requires="wps">
-            <w:drawing>
-              <wp:anchor behindDoc="1" distT="0" distB="0" distL="0" distR="0" simplePos="0" locked="0" layoutInCell="0" allowOverlap="1" relativeHeight="4">
-                <wp:simplePos x="0" y="0"/>
-                <wp:positionH relativeFrom="column">
-                  <wp:posOffset>5234940</wp:posOffset>
-                </wp:positionH>
-                <wp:positionV relativeFrom="paragraph">
-                  <wp:posOffset>76200</wp:posOffset>
-                </wp:positionV>
-                <wp:extent cx="1428115" cy="746125"/>
-                <wp:effectExtent l="0" t="0" r="0" b="0"/>
-                <wp:wrapSquare wrapText="bothSides"/>
-                <wp:docPr id="1" name="Shape1"/>
-                <a:graphic xmlns:a="http://schemas.openxmlformats.org/drawingml/2006/main">
-                  <a:graphicData uri="http://schemas.openxmlformats.org/drawingml/2006/picture">
-                    <pic:pic xmlns:pic="http://schemas.openxmlformats.org/drawingml/2006/picture">
-                      <pic:nvPicPr>
-                        <pic:cNvPr id="2" name="Shape1" descr=""/>
-                        <pic:cNvPicPr/>
-                      </pic:nvPicPr>
-                      <pic:blipFill>
-                        <a:blip r:embed="rId2"/>
-                        <a:stretch/>
-                      </pic:blipFill>
-                      <pic:spPr>
-                        <a:xfrm>
-                          <a:off x="0" y="0"/>
-                          <a:ext cx="1428120" cy="746280"/>
-                        </a:xfrm>
-                        <a:prstGeom prst="rect">
-                          <a:avLst/>
-                        </a:prstGeom>
-                        <a:ln w="0">
-                          <a:noFill/>
-                        </a:ln>
-                      </pic:spPr>
-                    </pic:pic>
-                  </a:graphicData>
-                </a:graphic>
-              </wp:anchor>
-            </w:drawing>
-          </mc:Choice>
-          <mc:Fallback>
-            <w:pict>
-              <v:shapetype id="_x0000_t75" coordsize="21600,21600" o:spt="75" o:preferrelative="t" path="m@4@5l@4@11@9@11@9@5xe" filled="f" stroked="f">
-                <v:stroke joinstyle="miter"/>
-                <v:formulas>
-                  <v:f eqn="if lineDrawn pixelLineWidth 0"/>
-                  <v:f eqn="sum @0 1 0"/>
-                  <v:f eqn="sum 0 0 @1"/>
-                  <v:f eqn="prod @2 1 2"/>
-                  <v:f eqn="prod @3 21600 pixelWidth"/>
-                  <v:f eqn="prod @3 21600 pixelHeight"/>
-                  <v:f eqn="sum @0 0 1"/>
-                  <v:f eqn="prod @6 1 2"/>
-                  <v:f eqn="prod @7 21600 pixelWidth"/>
-                  <v:f eqn="sum @8 21600 0"/>
-                  <v:f eqn="prod @7 21600 pixelHeight"/>
-                  <v:f eqn="sum @10 21600 0"/>
-                </v:formulas>
-                <v:path o:extrusionok="f" gradientshapeok="t" o:connecttype="rect"/>
-                <o:lock v:ext="edit" aspectratio="t"/>
-              </v:shapetype>
-              <v:shape id="shape_0" ID="Shape1" stroked="f" o:allowincell="f" style="position:absolute;margin-left:412.2pt;margin-top:6pt;width:112.4pt;height:58.7pt;mso-wrap-style:none;v-text-anchor:middle" type="_x0000_t75">
-                <v:imagedata r:id="rId3" o:detectmouseclick="t"/>
-                <v:stroke color="#3465a4" joinstyle="round" endcap="flat"/>
-                <w10:wrap type="square"/>
-              </v:shape>
-            </w:pict>
-          </mc:Fallback>
-        </mc:AlternateContent>
         <mc:AlternateContent>
           <mc:Choice Requires="wps">
             <w:drawing>
@@ -4735,60 +4662,6 @@
         <mc:AlternateContent>
           <mc:Choice Requires="wps">
             <w:drawing>
-              <wp:anchor behindDoc="1" distT="0" distB="0" distL="0" distR="0" simplePos="0" locked="0" layoutInCell="0" allowOverlap="1" relativeHeight="5">
-                <wp:simplePos x="0" y="0"/>
-                <wp:positionH relativeFrom="column">
-                  <wp:posOffset>5234940</wp:posOffset>
-                </wp:positionH>
-                <wp:positionV relativeFrom="paragraph">
-                  <wp:posOffset>76200</wp:posOffset>
-                </wp:positionV>
-                <wp:extent cx="1428115" cy="746125"/>
-                <wp:effectExtent l="0" t="0" r="0" b="0"/>
-                <wp:wrapSquare wrapText="bothSides"/>
-                <wp:docPr id="51" name="Shape50"/>
-                <a:graphic xmlns:a="http://schemas.openxmlformats.org/drawingml/2006/main">
-                  <a:graphicData uri="http://schemas.openxmlformats.org/drawingml/2006/picture">
-                    <pic:pic xmlns:pic="http://schemas.openxmlformats.org/drawingml/2006/picture">
-                      <pic:nvPicPr>
-                        <pic:cNvPr id="52" name="Shape50" descr=""/>
-                        <pic:cNvPicPr/>
-                      </pic:nvPicPr>
-                      <pic:blipFill>
-                        <a:blip r:embed="rId4"/>
-                        <a:stretch/>
-                      </pic:blipFill>
-                      <pic:spPr>
-                        <a:xfrm>
-                          <a:off x="0" y="0"/>
-                          <a:ext cx="1428120" cy="746280"/>
-                        </a:xfrm>
-                        <a:prstGeom prst="rect">
-                          <a:avLst/>
-                        </a:prstGeom>
-                        <a:ln w="0">
-                          <a:noFill/>
-                        </a:ln>
-                      </pic:spPr>
-                    </pic:pic>
-                  </a:graphicData>
-                </a:graphic>
-              </wp:anchor>
-            </w:drawing>
-          </mc:Choice>
-          <mc:Fallback>
-            <w:pict>
-              <v:shape id="shape_0" ID="Shape50" stroked="f" o:allowincell="f" style="position:absolute;margin-left:412.2pt;margin-top:6pt;width:112.4pt;height:58.7pt;mso-wrap-style:none;v-text-anchor:middle" type="_x0000_t75">
-                <v:imagedata r:id="rId5" o:detectmouseclick="t"/>
-                <v:stroke color="#3465a4" joinstyle="round" endcap="flat"/>
-                <w10:wrap type="square"/>
-              </v:shape>
-            </w:pict>
-          </mc:Fallback>
-        </mc:AlternateContent>
-        <mc:AlternateContent>
-          <mc:Choice Requires="wps">
-            <w:drawing>
               <wp:anchor behindDoc="1" distT="0" distB="0" distL="0" distR="0" simplePos="0" locked="0" layoutInCell="0" allowOverlap="1" relativeHeight="13">
                 <wp:simplePos x="0" y="0"/>
                 <wp:positionH relativeFrom="column">
@@ -9524,60 +9397,6 @@
         <mc:AlternateContent>
           <mc:Choice Requires="wps">
             <w:drawing>
-              <wp:anchor behindDoc="1" distT="0" distB="0" distL="0" distR="0" simplePos="0" locked="0" layoutInCell="0" allowOverlap="1" relativeHeight="3">
-                <wp:simplePos x="0" y="0"/>
-                <wp:positionH relativeFrom="column">
-                  <wp:posOffset>5234940</wp:posOffset>
-                </wp:positionH>
-                <wp:positionV relativeFrom="paragraph">
-                  <wp:posOffset>76200</wp:posOffset>
-                </wp:positionV>
-                <wp:extent cx="1428115" cy="746125"/>
-                <wp:effectExtent l="0" t="0" r="0" b="0"/>
-                <wp:wrapSquare wrapText="bothSides"/>
-                <wp:docPr id="102" name="Shape100"/>
-                <a:graphic xmlns:a="http://schemas.openxmlformats.org/drawingml/2006/main">
-                  <a:graphicData uri="http://schemas.openxmlformats.org/drawingml/2006/picture">
-                    <pic:pic xmlns:pic="http://schemas.openxmlformats.org/drawingml/2006/picture">
-                      <pic:nvPicPr>
-                        <pic:cNvPr id="103" name="Shape100" descr=""/>
-                        <pic:cNvPicPr/>
-                      </pic:nvPicPr>
-                      <pic:blipFill>
-                        <a:blip r:embed="rId6"/>
-                        <a:stretch/>
-                      </pic:blipFill>
-                      <pic:spPr>
-                        <a:xfrm>
-                          <a:off x="0" y="0"/>
-                          <a:ext cx="1428120" cy="746280"/>
-                        </a:xfrm>
-                        <a:prstGeom prst="rect">
-                          <a:avLst/>
-                        </a:prstGeom>
-                        <a:ln w="0">
-                          <a:noFill/>
-                        </a:ln>
-                      </pic:spPr>
-                    </pic:pic>
-                  </a:graphicData>
-                </a:graphic>
-              </wp:anchor>
-            </w:drawing>
-          </mc:Choice>
-          <mc:Fallback>
-            <w:pict>
-              <v:shape id="shape_0" ID="Shape100" stroked="f" o:allowincell="f" style="position:absolute;margin-left:412.2pt;margin-top:6pt;width:112.4pt;height:58.7pt;mso-wrap-style:none;v-text-anchor:middle" type="_x0000_t75">
-                <v:imagedata r:id="rId7" o:detectmouseclick="t"/>
-                <v:stroke color="#3465a4" joinstyle="round" endcap="flat"/>
-                <w10:wrap type="square"/>
-              </v:shape>
-            </w:pict>
-          </mc:Fallback>
-        </mc:AlternateContent>
-        <mc:AlternateContent>
-          <mc:Choice Requires="wps">
-            <w:drawing>
               <wp:anchor behindDoc="1" distT="0" distB="0" distL="0" distR="0" simplePos="0" locked="0" layoutInCell="0" allowOverlap="1" relativeHeight="12">
                 <wp:simplePos x="0" y="0"/>
                 <wp:positionH relativeFrom="column">
@@ -14975,60 +14794,6 @@
       </w:pPr>
       <w:r>
         <w:rPr/>
-        <mc:AlternateContent>
-          <mc:Choice Requires="wps">
-            <w:drawing>
-              <wp:anchor behindDoc="1" distT="0" distB="0" distL="0" distR="0" simplePos="0" locked="0" layoutInCell="0" allowOverlap="1" relativeHeight="2">
-                <wp:simplePos x="0" y="0"/>
-                <wp:positionH relativeFrom="column">
-                  <wp:posOffset>5234940</wp:posOffset>
-                </wp:positionH>
-                <wp:positionV relativeFrom="paragraph">
-                  <wp:posOffset>76200</wp:posOffset>
-                </wp:positionV>
-                <wp:extent cx="1428115" cy="746125"/>
-                <wp:effectExtent l="0" t="0" r="0" b="0"/>
-                <wp:wrapSquare wrapText="bothSides"/>
-                <wp:docPr id="160" name="Shape157"/>
-                <a:graphic xmlns:a="http://schemas.openxmlformats.org/drawingml/2006/main">
-                  <a:graphicData uri="http://schemas.openxmlformats.org/drawingml/2006/picture">
-                    <pic:pic xmlns:pic="http://schemas.openxmlformats.org/drawingml/2006/picture">
-                      <pic:nvPicPr>
-                        <pic:cNvPr id="161" name="Shape157" descr=""/>
-                        <pic:cNvPicPr/>
-                      </pic:nvPicPr>
-                      <pic:blipFill>
-                        <a:blip r:embed="rId8"/>
-                        <a:stretch/>
-                      </pic:blipFill>
-                      <pic:spPr>
-                        <a:xfrm>
-                          <a:off x="0" y="0"/>
-                          <a:ext cx="1428120" cy="746280"/>
-                        </a:xfrm>
-                        <a:prstGeom prst="rect">
-                          <a:avLst/>
-                        </a:prstGeom>
-                        <a:ln w="0">
-                          <a:noFill/>
-                        </a:ln>
-                      </pic:spPr>
-                    </pic:pic>
-                  </a:graphicData>
-                </a:graphic>
-              </wp:anchor>
-            </w:drawing>
-          </mc:Choice>
-          <mc:Fallback>
-            <w:pict>
-              <v:shape id="shape_0" ID="Shape157" stroked="f" o:allowincell="f" style="position:absolute;margin-left:412.2pt;margin-top:6pt;width:112.4pt;height:58.7pt;mso-wrap-style:none;v-text-anchor:middle" type="_x0000_t75">
-                <v:imagedata r:id="rId9" o:detectmouseclick="t"/>
-                <v:stroke color="#3465a4" joinstyle="round" endcap="flat"/>
-                <w10:wrap type="square"/>
-              </v:shape>
-            </w:pict>
-          </mc:Fallback>
-        </mc:AlternateContent>
         <mc:AlternateContent>
           <mc:Choice Requires="wps">
             <w:drawing>

</xml_diff>